<commit_message>
Diagramas UML no formato do draw.io
Os diagramas passam a ser arquivos .drawio nativos, editáveis no draw.io, com as formas UML padrão da ferramenta.

* Biblioteca drawio_uml.py que escreve mxGraphModel com os estilos UML do draw.io
* Gerador com layout definido para os 10 diagramas, sem linhas atravessando elementos
* PNGs exportados pelo próprio renderizador do draw.io (export3.html) no Chromium
* Verificador de texto também confere os rótulos dos .drawio
* Documento ABNT regenerado com as novas figuras
* Fontes PlantUML removidas

Co-Authored-By: Claude Opus 5.5 <noreply@anthropic.com>
Claude-Session: https://claude.ai/code/session_01T3pbjmHvzqDzErdbTGcrKD
</commit_message>
<xml_diff>
--- a/docs/entrega/Collection_Social_Documentacao.docx
+++ b/docs/entrega/Collection_Social_Documentacao.docx
@@ -8074,6 +8074,22 @@
     </w:p>
     <w:p>
       <w:pPr>
+        <w:spacing w:before="0" w:after="120" w:line="360" w:lineRule="auto"/>
+        <w:ind w:firstLine="709"/>
+        <w:jc w:val="both"/>
+      </w:pPr>
+      <w:r>
+        <w:rPr>
+          <w:rFonts w:ascii="Arial" w:hAnsi="Arial" w:cs="Arial"/>
+          <w:color w:val="000000"/>
+          <w:sz w:val="24"/>
+          <w:szCs w:val="24"/>
+        </w:rPr>
+        <w:t xml:space="preserve">Todos os diagramas desta seção foram elaborados no draw.io, com as formas da biblioteca UML da própria ferramenta. Os arquivos editáveis de cada diagrama acompanham o projeto, na pasta de modelagem, e podem ser abertos e alterados diretamente no draw.io.</w:t>
+      </w:r>
+    </w:p>
+    <w:p>
+      <w:pPr>
         <w:pStyle w:val="Ttulo1"/>
         <w:numPr>
           <w:ilvl w:val="1"/>
@@ -8277,7 +8293,7 @@
       <w:r>
         <w:drawing>
           <wp:inline xmlns:a="http://schemas.openxmlformats.org/drawingml/2006/main" xmlns:pic="http://schemas.openxmlformats.org/drawingml/2006/picture">
-            <wp:extent cx="5760000" cy="5268902"/>
+            <wp:extent cx="5760000" cy="4828502"/>
             <wp:docPr id="1" name="Picture 1"/>
             <wp:cNvGraphicFramePr>
               <a:graphicFrameLocks noChangeAspect="1"/>
@@ -8298,7 +8314,7 @@
                   <pic:spPr>
                     <a:xfrm>
                       <a:off x="0" y="0"/>
-                      <a:ext cx="5760000" cy="5268902"/>
+                      <a:ext cx="5760000" cy="4828502"/>
                     </a:xfrm>
                     <a:prstGeom prst="rect"/>
                   </pic:spPr>
@@ -8359,7 +8375,7 @@
       <w:r>
         <w:drawing>
           <wp:inline xmlns:a="http://schemas.openxmlformats.org/drawingml/2006/main" xmlns:pic="http://schemas.openxmlformats.org/drawingml/2006/picture">
-            <wp:extent cx="4242307" cy="7739999"/>
+            <wp:extent cx="5760000" cy="5623192"/>
             <wp:docPr id="2" name="Picture 2"/>
             <wp:cNvGraphicFramePr>
               <a:graphicFrameLocks noChangeAspect="1"/>
@@ -8380,7 +8396,7 @@
                   <pic:spPr>
                     <a:xfrm>
                       <a:off x="0" y="0"/>
-                      <a:ext cx="4242307" cy="7739999"/>
+                      <a:ext cx="5760000" cy="5623192"/>
                     </a:xfrm>
                     <a:prstGeom prst="rect"/>
                   </pic:spPr>
@@ -19255,7 +19271,7 @@
       <w:r>
         <w:drawing>
           <wp:inline xmlns:a="http://schemas.openxmlformats.org/drawingml/2006/main" xmlns:pic="http://schemas.openxmlformats.org/drawingml/2006/picture">
-            <wp:extent cx="5760000" cy="5926623"/>
+            <wp:extent cx="5760000" cy="5888000"/>
             <wp:docPr id="3" name="Picture 3"/>
             <wp:cNvGraphicFramePr>
               <a:graphicFrameLocks noChangeAspect="1"/>
@@ -19276,7 +19292,7 @@
                   <pic:spPr>
                     <a:xfrm>
                       <a:off x="0" y="0"/>
-                      <a:ext cx="5760000" cy="5926623"/>
+                      <a:ext cx="5760000" cy="5888000"/>
                     </a:xfrm>
                     <a:prstGeom prst="rect"/>
                   </pic:spPr>
@@ -19350,7 +19366,7 @@
       <w:r>
         <w:drawing>
           <wp:inline xmlns:a="http://schemas.openxmlformats.org/drawingml/2006/main" xmlns:pic="http://schemas.openxmlformats.org/drawingml/2006/picture">
-            <wp:extent cx="7845690" cy="4860000"/>
+            <wp:extent cx="8892000" cy="4356844"/>
             <wp:docPr id="4" name="Picture 4"/>
             <wp:cNvGraphicFramePr>
               <a:graphicFrameLocks noChangeAspect="1"/>
@@ -19371,7 +19387,7 @@
                   <pic:spPr>
                     <a:xfrm>
                       <a:off x="0" y="0"/>
-                      <a:ext cx="7845690" cy="4860000"/>
+                      <a:ext cx="8892000" cy="4356844"/>
                     </a:xfrm>
                     <a:prstGeom prst="rect"/>
                   </pic:spPr>
@@ -19432,7 +19448,7 @@
       <w:r>
         <w:drawing>
           <wp:inline xmlns:a="http://schemas.openxmlformats.org/drawingml/2006/main" xmlns:pic="http://schemas.openxmlformats.org/drawingml/2006/picture">
-            <wp:extent cx="7919859" cy="4860000"/>
+            <wp:extent cx="8402989" cy="4860000"/>
             <wp:docPr id="5" name="Picture 5"/>
             <wp:cNvGraphicFramePr>
               <a:graphicFrameLocks noChangeAspect="1"/>
@@ -19453,7 +19469,7 @@
                   <pic:spPr>
                     <a:xfrm>
                       <a:off x="0" y="0"/>
-                      <a:ext cx="7919859" cy="4860000"/>
+                      <a:ext cx="8402989" cy="4860000"/>
                     </a:xfrm>
                     <a:prstGeom prst="rect"/>
                   </pic:spPr>
@@ -19696,7 +19712,7 @@
       <w:r>
         <w:drawing>
           <wp:inline xmlns:a="http://schemas.openxmlformats.org/drawingml/2006/main" xmlns:pic="http://schemas.openxmlformats.org/drawingml/2006/picture">
-            <wp:extent cx="5760000" cy="6465485"/>
+            <wp:extent cx="5454460" cy="7740000"/>
             <wp:docPr id="6" name="Picture 6"/>
             <wp:cNvGraphicFramePr>
               <a:graphicFrameLocks noChangeAspect="1"/>
@@ -19717,7 +19733,7 @@
                   <pic:spPr>
                     <a:xfrm>
                       <a:off x="0" y="0"/>
-                      <a:ext cx="5760000" cy="6465485"/>
+                      <a:ext cx="5454460" cy="7740000"/>
                     </a:xfrm>
                     <a:prstGeom prst="rect"/>
                   </pic:spPr>
@@ -19960,7 +19976,7 @@
       <w:r>
         <w:drawing>
           <wp:inline xmlns:a="http://schemas.openxmlformats.org/drawingml/2006/main" xmlns:pic="http://schemas.openxmlformats.org/drawingml/2006/picture">
-            <wp:extent cx="7909910" cy="4859999"/>
+            <wp:extent cx="5747067" cy="4859999"/>
             <wp:docPr id="7" name="Picture 7"/>
             <wp:cNvGraphicFramePr>
               <a:graphicFrameLocks noChangeAspect="1"/>
@@ -19981,7 +19997,7 @@
                   <pic:spPr>
                     <a:xfrm>
                       <a:off x="0" y="0"/>
-                      <a:ext cx="7909910" cy="4859999"/>
+                      <a:ext cx="5747067" cy="4859999"/>
                     </a:xfrm>
                     <a:prstGeom prst="rect"/>
                   </pic:spPr>
@@ -20224,7 +20240,7 @@
       <w:r>
         <w:drawing>
           <wp:inline xmlns:a="http://schemas.openxmlformats.org/drawingml/2006/main" xmlns:pic="http://schemas.openxmlformats.org/drawingml/2006/picture">
-            <wp:extent cx="5760000" cy="3933867"/>
+            <wp:extent cx="5760000" cy="5097767"/>
             <wp:docPr id="8" name="Picture 8"/>
             <wp:cNvGraphicFramePr>
               <a:graphicFrameLocks noChangeAspect="1"/>
@@ -20245,7 +20261,7 @@
                   <pic:spPr>
                     <a:xfrm>
                       <a:off x="0" y="0"/>
-                      <a:ext cx="5760000" cy="3933867"/>
+                      <a:ext cx="5760000" cy="5097767"/>
                     </a:xfrm>
                     <a:prstGeom prst="rect"/>
                   </pic:spPr>
@@ -20476,7 +20492,7 @@
       <w:r>
         <w:drawing>
           <wp:inline xmlns:a="http://schemas.openxmlformats.org/drawingml/2006/main" xmlns:pic="http://schemas.openxmlformats.org/drawingml/2006/picture">
-            <wp:extent cx="5760000" cy="4953600"/>
+            <wp:extent cx="5760000" cy="4111604"/>
             <wp:docPr id="9" name="Picture 9"/>
             <wp:cNvGraphicFramePr>
               <a:graphicFrameLocks noChangeAspect="1"/>
@@ -20497,7 +20513,7 @@
                   <pic:spPr>
                     <a:xfrm>
                       <a:off x="0" y="0"/>
-                      <a:ext cx="5760000" cy="4953600"/>
+                      <a:ext cx="5760000" cy="4111604"/>
                     </a:xfrm>
                     <a:prstGeom prst="rect"/>
                   </pic:spPr>
@@ -20695,6 +20711,18 @@
     </w:p>
     <w:p>
       <w:pPr>
+        <w:spacing w:after="0" w:line="240" w:lineRule="auto"/>
+        <w:sectPr>
+          <w:footerReference w:type="default" r:id="rId10"/>
+          <w:pgSz w:w="11906" w:h="16838"/>
+          <w:pgMar w:top="1701" w:right="1134" w:bottom="1134" w:left="1701" w:header="720" w:footer="720" w:gutter="0"/>
+          <w:cols w:space="720"/>
+          <w:docGrid w:linePitch="360"/>
+        </w:sectPr>
+      </w:pPr>
+    </w:p>
+    <w:p>
+      <w:pPr>
         <w:keepNext/>
         <w:spacing w:before="240" w:after="120" w:line="240" w:lineRule="auto"/>
         <w:jc w:val="center"/>
@@ -20728,7 +20756,7 @@
       <w:r>
         <w:drawing>
           <wp:inline xmlns:a="http://schemas.openxmlformats.org/drawingml/2006/main" xmlns:pic="http://schemas.openxmlformats.org/drawingml/2006/picture">
-            <wp:extent cx="5760000" cy="5077781"/>
+            <wp:extent cx="8892000" cy="4060913"/>
             <wp:docPr id="10" name="Picture 10"/>
             <wp:cNvGraphicFramePr>
               <a:graphicFrameLocks noChangeAspect="1"/>
@@ -20749,7 +20777,7 @@
                   <pic:spPr>
                     <a:xfrm>
                       <a:off x="0" y="0"/>
-                      <a:ext cx="5760000" cy="5077781"/>
+                      <a:ext cx="8892000" cy="4060913"/>
                     </a:xfrm>
                     <a:prstGeom prst="rect"/>
                   </pic:spPr>
@@ -20774,6 +20802,18 @@
         </w:rPr>
         <w:t xml:space="preserve">Fonte. Elaborado pelos autores (2026).</w:t>
       </w:r>
+    </w:p>
+    <w:p>
+      <w:pPr>
+        <w:spacing w:after="0" w:line="240" w:lineRule="auto"/>
+        <w:sectPr>
+          <w:footerReference w:type="default" r:id="rId10"/>
+          <w:pgSz w:w="16838" w:h="11906" w:orient="landscape"/>
+          <w:pgMar w:top="1701" w:right="1134" w:bottom="1134" w:left="1701" w:header="720" w:footer="720" w:gutter="0"/>
+          <w:cols w:space="720"/>
+          <w:docGrid w:linePitch="360"/>
+        </w:sectPr>
+      </w:pPr>
     </w:p>
     <w:p>
       <w:pPr>

</xml_diff>